<commit_message>
iterációk koordinátás alakjainak levezetése
</commit_message>
<xml_diff>
--- a/3. félév/NumMod_1/Nummód vizsga/docx/19.docx
+++ b/3. félév/NumMod_1/Nummód vizsga/docx/19.docx
@@ -18,11 +18,34 @@
           <w:sz w:val="36"/>
           <w:szCs w:val="36"/>
         </w:rPr>
-        <w:t>19. A Jacobi-iteráció.</w:t>
+        <w:t xml:space="preserve">19. A </w:t>
+      </w:r>
+      <w:proofErr w:type="spellStart"/>
+      <w:r>
+        <w:rPr>
+          <w:b/>
+          <w:bCs/>
+          <w:sz w:val="36"/>
+          <w:szCs w:val="36"/>
+        </w:rPr>
+        <w:t>Jacobi</w:t>
+      </w:r>
+      <w:proofErr w:type="spellEnd"/>
+      <w:r>
+        <w:rPr>
+          <w:b/>
+          <w:bCs/>
+          <w:sz w:val="36"/>
+          <w:szCs w:val="36"/>
+        </w:rPr>
+        <w:t>-iteráció.</w:t>
       </w:r>
     </w:p>
     <w:p>
       <w:r>
+        <w:rPr>
+          <w:noProof/>
+        </w:rPr>
         <w:drawing>
           <wp:inline distT="0" distB="0" distL="0" distR="0" wp14:anchorId="27000246" wp14:editId="22153DFE">
             <wp:extent cx="5760720" cy="543560"/>
@@ -62,6 +85,9 @@
     </w:p>
     <w:p>
       <w:r>
+        <w:rPr>
+          <w:noProof/>
+        </w:rPr>
         <w:drawing>
           <wp:inline distT="0" distB="0" distL="0" distR="0" wp14:anchorId="46271480" wp14:editId="06A48516">
             <wp:extent cx="5760720" cy="3578225"/>
@@ -101,6 +127,65 @@
     </w:p>
     <w:p>
       <w:r>
+        <w:rPr>
+          <w:noProof/>
+        </w:rPr>
+        <w:lastRenderedPageBreak/>
+        <w:drawing>
+          <wp:inline distT="0" distB="0" distL="0" distR="0" wp14:anchorId="4BE0E11E" wp14:editId="36F6D6D8">
+            <wp:extent cx="5753100" cy="4991100"/>
+            <wp:effectExtent l="0" t="0" r="0" b="0"/>
+            <wp:docPr id="100564905" name="Kép 1"/>
+            <wp:cNvGraphicFramePr>
+              <a:graphicFrameLocks xmlns:a="http://schemas.openxmlformats.org/drawingml/2006/main" noChangeAspect="1"/>
+            </wp:cNvGraphicFramePr>
+            <a:graphic xmlns:a="http://schemas.openxmlformats.org/drawingml/2006/main">
+              <a:graphicData uri="http://schemas.openxmlformats.org/drawingml/2006/picture">
+                <pic:pic xmlns:pic="http://schemas.openxmlformats.org/drawingml/2006/picture">
+                  <pic:nvPicPr>
+                    <pic:cNvPr id="0" name="Picture 1"/>
+                    <pic:cNvPicPr>
+                      <a:picLocks noChangeAspect="1" noChangeArrowheads="1"/>
+                    </pic:cNvPicPr>
+                  </pic:nvPicPr>
+                  <pic:blipFill>
+                    <a:blip r:embed="rId6">
+                      <a:extLst>
+                        <a:ext uri="{28A0092B-C50C-407E-A947-70E740481C1C}">
+                          <a14:useLocalDpi xmlns:a14="http://schemas.microsoft.com/office/drawing/2010/main" val="0"/>
+                        </a:ext>
+                      </a:extLst>
+                    </a:blip>
+                    <a:srcRect/>
+                    <a:stretch>
+                      <a:fillRect/>
+                    </a:stretch>
+                  </pic:blipFill>
+                  <pic:spPr bwMode="auto">
+                    <a:xfrm>
+                      <a:off x="0" y="0"/>
+                      <a:ext cx="5753100" cy="4991100"/>
+                    </a:xfrm>
+                    <a:prstGeom prst="rect">
+                      <a:avLst/>
+                    </a:prstGeom>
+                    <a:noFill/>
+                    <a:ln>
+                      <a:noFill/>
+                    </a:ln>
+                  </pic:spPr>
+                </pic:pic>
+              </a:graphicData>
+            </a:graphic>
+          </wp:inline>
+        </w:drawing>
+      </w:r>
+    </w:p>
+    <w:p>
+      <w:r>
+        <w:rPr>
+          <w:noProof/>
+        </w:rPr>
         <w:drawing>
           <wp:inline distT="0" distB="0" distL="0" distR="0" wp14:anchorId="08B6E190" wp14:editId="33268E1C">
             <wp:extent cx="5760720" cy="1584960"/>
@@ -117,7 +202,7 @@
                     <pic:cNvPicPr/>
                   </pic:nvPicPr>
                   <pic:blipFill>
-                    <a:blip r:embed="rId6"/>
+                    <a:blip r:embed="rId7"/>
                     <a:stretch>
                       <a:fillRect/>
                     </a:stretch>
@@ -140,6 +225,9 @@
     </w:p>
     <w:p>
       <w:r>
+        <w:rPr>
+          <w:noProof/>
+        </w:rPr>
         <w:lastRenderedPageBreak/>
         <w:drawing>
           <wp:inline distT="0" distB="0" distL="0" distR="0" wp14:anchorId="3575715C" wp14:editId="6A010716">
@@ -157,7 +245,7 @@
                     <pic:cNvPicPr/>
                   </pic:nvPicPr>
                   <pic:blipFill>
-                    <a:blip r:embed="rId7"/>
+                    <a:blip r:embed="rId8"/>
                     <a:stretch>
                       <a:fillRect/>
                     </a:stretch>
@@ -180,6 +268,9 @@
     </w:p>
     <w:p>
       <w:r>
+        <w:rPr>
+          <w:noProof/>
+        </w:rPr>
         <w:drawing>
           <wp:inline distT="0" distB="0" distL="0" distR="0" wp14:anchorId="72BAD551" wp14:editId="11774E5B">
             <wp:extent cx="5760720" cy="3720465"/>
@@ -196,7 +287,7 @@
                     <pic:cNvPicPr/>
                   </pic:nvPicPr>
                   <pic:blipFill>
-                    <a:blip r:embed="rId8"/>
+                    <a:blip r:embed="rId9"/>
                     <a:stretch>
                       <a:fillRect/>
                     </a:stretch>

</xml_diff>